<commit_message>
Poprawki w kodzie i w dokumentacji
</commit_message>
<xml_diff>
--- a/Dokumentacja Projektowa Kosiarkobot 2.docx
+++ b/Dokumentacja Projektowa Kosiarkobot 2.docx
@@ -194,13 +194,8 @@
         <w:t xml:space="preserve"> </w:t>
       </w:r>
       <w:r>
-        <w:t>"</w:t>
-      </w:r>
-      <w:proofErr w:type="spellStart"/>
-      <w:r>
-        <w:t>Kosiarkobot</w:t>
-      </w:r>
-      <w:proofErr w:type="spellEnd"/>
+        <w:t>"Kosiarkobot</w:t>
+      </w:r>
       <w:r>
         <w:rPr>
           <w:spacing w:val="-9"/>
@@ -607,6 +602,13 @@
     </w:p>
     <w:sdt>
       <w:sdtPr>
+        <w:rPr>
+          <w:rFonts w:ascii="Arial MT" w:eastAsia="Arial MT" w:hAnsi="Arial MT" w:cs="Arial MT"/>
+          <w:color w:val="auto"/>
+          <w:sz w:val="22"/>
+          <w:szCs w:val="22"/>
+          <w:lang w:eastAsia="en-US"/>
+        </w:rPr>
         <w:id w:val="-1358419117"/>
         <w:docPartObj>
           <w:docPartGallery w:val="Table of Contents"/>
@@ -615,13 +617,8 @@
       </w:sdtPr>
       <w:sdtEndPr>
         <w:rPr>
-          <w:rFonts w:ascii="Arial MT" w:eastAsia="Arial MT" w:hAnsi="Arial MT" w:cs="Arial MT"/>
           <w:b/>
           <w:bCs/>
-          <w:color w:val="auto"/>
-          <w:sz w:val="22"/>
-          <w:szCs w:val="22"/>
-          <w:lang w:eastAsia="en-US"/>
         </w:rPr>
       </w:sdtEndPr>
       <w:sdtContent>
@@ -2828,10 +2825,7 @@
       <w:bookmarkEnd w:id="3"/>
       <w:r>
         <w:lastRenderedPageBreak/>
-        <w:t>I</w:t>
-      </w:r>
-      <w:r>
-        <w:t xml:space="preserve">nformacje </w:t>
+        <w:t xml:space="preserve">Informacje </w:t>
       </w:r>
       <w:r>
         <w:rPr>
@@ -2874,7 +2868,6 @@
         </w:rPr>
         <w:t xml:space="preserve"> </w:t>
       </w:r>
-      <w:proofErr w:type="spellStart"/>
       <w:r>
         <w:rPr>
           <w:rFonts w:ascii="Arial" w:hAnsi="Arial"/>
@@ -2883,7 +2876,6 @@
         </w:rPr>
         <w:t>Kosiarkobot</w:t>
       </w:r>
-      <w:proofErr w:type="spellEnd"/>
       <w:r>
         <w:rPr>
           <w:spacing w:val="-4"/>
@@ -2963,10 +2955,7 @@
         <w:t xml:space="preserve">się </w:t>
       </w:r>
       <w:r>
-        <w:t>dystrybut</w:t>
-      </w:r>
-      <w:r>
-        <w:t xml:space="preserve">or nowoczesnych robotów ogrodowych, zgłosiło zapotrzebowanie na </w:t>
+        <w:t xml:space="preserve">dystrybutor nowoczesnych robotów ogrodowych, zgłosiło zapotrzebowanie na </w:t>
       </w:r>
       <w:r>
         <w:rPr>
@@ -3168,10 +3157,7 @@
         <w:t xml:space="preserve"> </w:t>
       </w:r>
       <w:r>
-        <w:t>desk</w:t>
-      </w:r>
-      <w:r>
-        <w:t>topowej.</w:t>
+        <w:t>desktopowej.</w:t>
       </w:r>
       <w:r>
         <w:rPr>
@@ -3197,11 +3183,9 @@
         </w:rPr>
         <w:t xml:space="preserve"> </w:t>
       </w:r>
-      <w:proofErr w:type="spellStart"/>
       <w:r>
         <w:t>zmigrowany</w:t>
       </w:r>
-      <w:proofErr w:type="spellEnd"/>
       <w:r>
         <w:rPr>
           <w:spacing w:val="-15"/>
@@ -3236,15 +3220,7 @@
         <w:t xml:space="preserve"> </w:t>
       </w:r>
       <w:r>
-        <w:t>(</w:t>
-      </w:r>
-      <w:proofErr w:type="spellStart"/>
-      <w:r>
-        <w:t>JavaFX</w:t>
-      </w:r>
-      <w:proofErr w:type="spellEnd"/>
-      <w:r>
-        <w:t>)</w:t>
+        <w:t>(JavaFX)</w:t>
       </w:r>
       <w:r>
         <w:rPr>
@@ -3288,11 +3264,9 @@
         </w:rPr>
         <w:t xml:space="preserve"> </w:t>
       </w:r>
-      <w:proofErr w:type="spellStart"/>
       <w:r>
         <w:t>frameworka</w:t>
       </w:r>
-      <w:proofErr w:type="spellEnd"/>
       <w:r>
         <w:rPr>
           <w:spacing w:val="-3"/>
@@ -3314,7 +3288,6 @@
         </w:rPr>
         <w:t xml:space="preserve"> </w:t>
       </w:r>
-      <w:proofErr w:type="spellStart"/>
       <w:r>
         <w:rPr>
           <w:rFonts w:ascii="Arial" w:hAnsi="Arial"/>
@@ -3322,7 +3295,6 @@
         </w:rPr>
         <w:t>Boot</w:t>
       </w:r>
-      <w:proofErr w:type="spellEnd"/>
       <w:r>
         <w:rPr>
           <w:rFonts w:ascii="Arial" w:hAnsi="Arial"/>
@@ -3358,7 +3330,6 @@
         </w:rPr>
         <w:t xml:space="preserve">danych </w:t>
       </w:r>
-      <w:proofErr w:type="spellStart"/>
       <w:r>
         <w:rPr>
           <w:rFonts w:ascii="Arial" w:hAnsi="Arial"/>
@@ -3367,7 +3338,6 @@
         </w:rPr>
         <w:t>PostgreSQL</w:t>
       </w:r>
-      <w:proofErr w:type="spellEnd"/>
       <w:r>
         <w:rPr>
           <w:spacing w:val="-4"/>
@@ -4442,25 +4412,7 @@
           <w:b/>
           <w:spacing w:val="-2"/>
         </w:rPr>
-        <w:t>(</w:t>
-      </w:r>
-      <w:proofErr w:type="spellStart"/>
-      <w:r>
-        <w:rPr>
-          <w:rFonts w:ascii="Arial" w:hAnsi="Arial"/>
-          <w:b/>
-          <w:spacing w:val="-2"/>
-        </w:rPr>
-        <w:t>Create</w:t>
-      </w:r>
-      <w:proofErr w:type="spellEnd"/>
-      <w:r>
-        <w:rPr>
-          <w:rFonts w:ascii="Arial" w:hAnsi="Arial"/>
-          <w:b/>
-          <w:spacing w:val="-2"/>
-        </w:rPr>
-        <w:t>):</w:t>
+        <w:t>(Create):</w:t>
       </w:r>
       <w:r>
         <w:rPr>
@@ -4692,23 +4644,7 @@
           <w:rFonts w:ascii="Arial" w:hAnsi="Arial"/>
           <w:b/>
         </w:rPr>
-        <w:t>(</w:t>
-      </w:r>
-      <w:proofErr w:type="spellStart"/>
-      <w:r>
-        <w:rPr>
-          <w:rFonts w:ascii="Arial" w:hAnsi="Arial"/>
-          <w:b/>
-        </w:rPr>
-        <w:t>Delete</w:t>
-      </w:r>
-      <w:proofErr w:type="spellEnd"/>
-      <w:r>
-        <w:rPr>
-          <w:rFonts w:ascii="Arial" w:hAnsi="Arial"/>
-          <w:b/>
-        </w:rPr>
-        <w:t>):</w:t>
+        <w:t>(Delete):</w:t>
       </w:r>
       <w:r>
         <w:rPr>
@@ -5339,19 +5275,11 @@
         </w:rPr>
         <w:t xml:space="preserve"> </w:t>
       </w:r>
-      <w:proofErr w:type="spellStart"/>
-      <w:r>
-        <w:rPr>
-          <w:spacing w:val="-2"/>
-        </w:rPr>
-        <w:t>Stack</w:t>
-      </w:r>
-      <w:proofErr w:type="spellEnd"/>
-      <w:r>
-        <w:rPr>
-          <w:spacing w:val="-2"/>
-        </w:rPr>
-        <w:t>)</w:t>
+      <w:r>
+        <w:rPr>
+          <w:spacing w:val="-2"/>
+        </w:rPr>
+        <w:t>Stack)</w:t>
       </w:r>
       <w:r>
         <w:rPr>
@@ -5535,11 +5463,9 @@
         </w:rPr>
         <w:t xml:space="preserve"> </w:t>
       </w:r>
-      <w:proofErr w:type="spellStart"/>
       <w:r>
         <w:t>Stream</w:t>
       </w:r>
-      <w:proofErr w:type="spellEnd"/>
       <w:r>
         <w:rPr>
           <w:spacing w:val="-1"/>
@@ -5604,34 +5530,10 @@
           <w:rFonts w:ascii="Arial" w:hAnsi="Arial"/>
           <w:b/>
         </w:rPr>
-        <w:t xml:space="preserve">Spring </w:t>
-      </w:r>
-      <w:proofErr w:type="spellStart"/>
-      <w:r>
-        <w:rPr>
-          <w:rFonts w:ascii="Arial" w:hAnsi="Arial"/>
-          <w:b/>
-        </w:rPr>
-        <w:t>Boot</w:t>
-      </w:r>
-      <w:proofErr w:type="spellEnd"/>
-      <w:r>
-        <w:rPr>
-          <w:rFonts w:ascii="Arial" w:hAnsi="Arial"/>
-          <w:b/>
-        </w:rPr>
-        <w:t xml:space="preserve"> (wersja 3.x): </w:t>
-      </w:r>
-      <w:r>
-        <w:t xml:space="preserve">Wybrany jako fundament </w:t>
-      </w:r>
-      <w:proofErr w:type="spellStart"/>
-      <w:r>
-        <w:t>backendu</w:t>
-      </w:r>
-      <w:proofErr w:type="spellEnd"/>
-      <w:r>
-        <w:t xml:space="preserve"> ze względu na wbudowany</w:t>
+        <w:t xml:space="preserve">Spring Boot (wersja 3.x): </w:t>
+      </w:r>
+      <w:r>
+        <w:t>Wybrany jako fundament backendu ze względu na wbudowany</w:t>
       </w:r>
       <w:r>
         <w:rPr>
@@ -5666,13 +5568,8 @@
         </w:rPr>
         <w:t xml:space="preserve"> </w:t>
       </w:r>
-      <w:proofErr w:type="spellStart"/>
-      <w:r>
-        <w:t>Tomcat</w:t>
-      </w:r>
-      <w:proofErr w:type="spellEnd"/>
-      <w:r>
-        <w:t>)</w:t>
+      <w:r>
+        <w:t>Tomcat)</w:t>
       </w:r>
       <w:r>
         <w:rPr>
@@ -5705,21 +5602,7 @@
         <w:rPr>
           <w:spacing w:val="-6"/>
         </w:rPr>
-        <w:t>wstrzykiwania zależności (</w:t>
-      </w:r>
-      <w:proofErr w:type="spellStart"/>
-      <w:r>
-        <w:rPr>
-          <w:spacing w:val="-6"/>
-        </w:rPr>
-        <w:t>Inversion</w:t>
-      </w:r>
-      <w:proofErr w:type="spellEnd"/>
-      <w:r>
-        <w:rPr>
-          <w:spacing w:val="-6"/>
-        </w:rPr>
-        <w:t xml:space="preserve"> of Control), co drastycznie redukuje ilość kodu </w:t>
+        <w:t xml:space="preserve">wstrzykiwania zależności (Inversion of Control), co drastycznie redukuje ilość kodu </w:t>
       </w:r>
       <w:r>
         <w:t>konfiguracyjnego w porównaniu do standardowych aplikacji Java EE.</w:t>
@@ -5738,28 +5621,18 @@
         <w:spacing w:before="4" w:line="312" w:lineRule="auto"/>
         <w:ind w:right="361"/>
       </w:pPr>
-      <w:proofErr w:type="spellStart"/>
       <w:r>
         <w:rPr>
           <w:rFonts w:ascii="Arial" w:hAnsi="Arial"/>
           <w:b/>
           <w:spacing w:val="-4"/>
         </w:rPr>
-        <w:t>PostgreSQL</w:t>
-      </w:r>
-      <w:proofErr w:type="spellEnd"/>
+        <w:t>PostgreSQL:</w:t>
+      </w:r>
       <w:r>
         <w:rPr>
           <w:rFonts w:ascii="Arial" w:hAnsi="Arial"/>
           <w:b/>
-          <w:spacing w:val="-4"/>
-        </w:rPr>
-        <w:t>:</w:t>
-      </w:r>
-      <w:r>
-        <w:rPr>
-          <w:rFonts w:ascii="Arial" w:hAnsi="Arial"/>
-          <w:b/>
           <w:spacing w:val="-12"/>
         </w:rPr>
         <w:t xml:space="preserve"> </w:t>
@@ -5776,14 +5649,12 @@
         </w:rPr>
         <w:t xml:space="preserve"> </w:t>
       </w:r>
-      <w:proofErr w:type="spellStart"/>
       <w:r>
         <w:rPr>
           <w:spacing w:val="-4"/>
         </w:rPr>
         <w:t>otwartoźródłowy</w:t>
       </w:r>
-      <w:proofErr w:type="spellEnd"/>
       <w:r>
         <w:rPr>
           <w:spacing w:val="-11"/>
@@ -5903,21 +5774,12 @@
         <w:spacing w:before="4" w:line="312" w:lineRule="auto"/>
         <w:ind w:right="845"/>
       </w:pPr>
-      <w:proofErr w:type="spellStart"/>
       <w:r>
         <w:rPr>
           <w:rFonts w:ascii="Arial" w:hAnsi="Arial"/>
           <w:b/>
         </w:rPr>
-        <w:t>Hibernate</w:t>
-      </w:r>
-      <w:proofErr w:type="spellEnd"/>
-      <w:r>
-        <w:rPr>
-          <w:rFonts w:ascii="Arial" w:hAnsi="Arial"/>
-          <w:b/>
-        </w:rPr>
-        <w:t xml:space="preserve"> / Spring Data JPA: </w:t>
+        <w:t xml:space="preserve">Hibernate / Spring Data JPA: </w:t>
       </w:r>
       <w:r>
         <w:t xml:space="preserve">Biblioteka mapowania obiektowo-relacyjnego </w:t>
@@ -6065,62 +5927,89 @@
         <w:spacing w:before="3" w:line="312" w:lineRule="auto"/>
         <w:ind w:right="308"/>
       </w:pPr>
-      <w:proofErr w:type="spellStart"/>
       <w:r>
         <w:rPr>
           <w:rFonts w:ascii="Arial" w:hAnsi="Arial"/>
           <w:b/>
         </w:rPr>
-        <w:t>Thymeleaf</w:t>
-      </w:r>
-      <w:proofErr w:type="spellEnd"/>
+        <w:t>Thymeleaf,</w:t>
+      </w:r>
       <w:r>
         <w:rPr>
           <w:rFonts w:ascii="Arial" w:hAnsi="Arial"/>
           <w:b/>
-        </w:rPr>
-        <w:t>,</w:t>
+          <w:spacing w:val="-16"/>
+        </w:rPr>
+        <w:t xml:space="preserve"> </w:t>
       </w:r>
       <w:r>
         <w:rPr>
           <w:rFonts w:ascii="Arial" w:hAnsi="Arial"/>
           <w:b/>
+        </w:rPr>
+        <w:t>HTML5,</w:t>
+      </w:r>
+      <w:r>
+        <w:rPr>
+          <w:rFonts w:ascii="Arial" w:hAnsi="Arial"/>
+          <w:b/>
+          <w:spacing w:val="-15"/>
+        </w:rPr>
+        <w:t xml:space="preserve"> </w:t>
+      </w:r>
+      <w:r>
+        <w:rPr>
+          <w:rFonts w:ascii="Arial" w:hAnsi="Arial"/>
+          <w:b/>
+        </w:rPr>
+        <w:t>CSS3:</w:t>
+      </w:r>
+      <w:r>
+        <w:rPr>
+          <w:rFonts w:ascii="Arial" w:hAnsi="Arial"/>
+          <w:b/>
+          <w:spacing w:val="-15"/>
+        </w:rPr>
+        <w:t xml:space="preserve"> </w:t>
+      </w:r>
+      <w:r>
+        <w:t>Silnik</w:t>
+      </w:r>
+      <w:r>
+        <w:rPr>
           <w:spacing w:val="-16"/>
         </w:rPr>
         <w:t xml:space="preserve"> </w:t>
       </w:r>
       <w:r>
-        <w:rPr>
-          <w:rFonts w:ascii="Arial" w:hAnsi="Arial"/>
-          <w:b/>
-        </w:rPr>
-        <w:t>HTML5,</w:t>
-      </w:r>
-      <w:r>
-        <w:rPr>
-          <w:rFonts w:ascii="Arial" w:hAnsi="Arial"/>
-          <w:b/>
+        <w:t>szablonów,</w:t>
+      </w:r>
+      <w:r>
+        <w:rPr>
           <w:spacing w:val="-15"/>
         </w:rPr>
         <w:t xml:space="preserve"> </w:t>
       </w:r>
       <w:r>
-        <w:rPr>
-          <w:rFonts w:ascii="Arial" w:hAnsi="Arial"/>
-          <w:b/>
-        </w:rPr>
-        <w:t>CSS3:</w:t>
-      </w:r>
-      <w:r>
-        <w:rPr>
-          <w:rFonts w:ascii="Arial" w:hAnsi="Arial"/>
-          <w:b/>
+        <w:t>który</w:t>
+      </w:r>
+      <w:r>
+        <w:rPr>
           <w:spacing w:val="-15"/>
         </w:rPr>
         <w:t xml:space="preserve"> </w:t>
       </w:r>
       <w:r>
-        <w:t>Silnik</w:t>
+        <w:t>zastąpił</w:t>
+      </w:r>
+      <w:r>
+        <w:rPr>
+          <w:spacing w:val="-15"/>
+        </w:rPr>
+        <w:t xml:space="preserve"> </w:t>
+      </w:r>
+      <w:r>
+        <w:t>widoki</w:t>
       </w:r>
       <w:r>
         <w:rPr>
@@ -6129,7 +6018,7 @@
         <w:t xml:space="preserve"> </w:t>
       </w:r>
       <w:r>
-        <w:t>szablonów,</w:t>
+        <w:t>FXML</w:t>
       </w:r>
       <w:r>
         <w:rPr>
@@ -6138,7 +6027,7 @@
         <w:t xml:space="preserve"> </w:t>
       </w:r>
       <w:r>
-        <w:t>który</w:t>
+        <w:t>z</w:t>
       </w:r>
       <w:r>
         <w:rPr>
@@ -6147,48 +6036,7 @@
         <w:t xml:space="preserve"> </w:t>
       </w:r>
       <w:r>
-        <w:t>zastąpił</w:t>
-      </w:r>
-      <w:r>
-        <w:rPr>
-          <w:spacing w:val="-15"/>
-        </w:rPr>
-        <w:t xml:space="preserve"> </w:t>
-      </w:r>
-      <w:r>
-        <w:t>widoki</w:t>
-      </w:r>
-      <w:r>
-        <w:rPr>
-          <w:spacing w:val="-16"/>
-        </w:rPr>
-        <w:t xml:space="preserve"> </w:t>
-      </w:r>
-      <w:r>
-        <w:t>FXML</w:t>
-      </w:r>
-      <w:r>
-        <w:rPr>
-          <w:spacing w:val="-15"/>
-        </w:rPr>
-        <w:t xml:space="preserve"> </w:t>
-      </w:r>
-      <w:r>
-        <w:t>z</w:t>
-      </w:r>
-      <w:r>
-        <w:rPr>
-          <w:spacing w:val="-15"/>
-        </w:rPr>
-        <w:t xml:space="preserve"> </w:t>
-      </w:r>
-      <w:proofErr w:type="spellStart"/>
-      <w:r>
-        <w:t>JavaFX</w:t>
-      </w:r>
-      <w:proofErr w:type="spellEnd"/>
-      <w:r>
-        <w:t>. Pozwala</w:t>
+        <w:t>JavaFX. Pozwala</w:t>
       </w:r>
       <w:r>
         <w:rPr>
@@ -6214,11 +6062,9 @@
         </w:rPr>
         <w:t xml:space="preserve"> </w:t>
       </w:r>
-      <w:proofErr w:type="spellStart"/>
       <w:r>
         <w:t>renderowanie</w:t>
       </w:r>
-      <w:proofErr w:type="spellEnd"/>
       <w:r>
         <w:rPr>
           <w:spacing w:val="-2"/>
@@ -6303,23 +6149,13 @@
         </w:rPr>
         <w:t xml:space="preserve"> </w:t>
       </w:r>
-      <w:proofErr w:type="spellStart"/>
       <w:r>
         <w:rPr>
           <w:rFonts w:ascii="Arial" w:hAnsi="Arial"/>
           <w:b/>
           <w:spacing w:val="-2"/>
         </w:rPr>
-        <w:t>Maven</w:t>
-      </w:r>
-      <w:proofErr w:type="spellEnd"/>
-      <w:r>
-        <w:rPr>
-          <w:rFonts w:ascii="Arial" w:hAnsi="Arial"/>
-          <w:b/>
-          <w:spacing w:val="-2"/>
-        </w:rPr>
-        <w:t>:</w:t>
+        <w:t>Maven:</w:t>
       </w:r>
       <w:r>
         <w:rPr>
@@ -6565,25 +6401,7 @@
           <w:b/>
           <w:spacing w:val="-2"/>
         </w:rPr>
-        <w:t>(Model-</w:t>
-      </w:r>
-      <w:proofErr w:type="spellStart"/>
-      <w:r>
-        <w:rPr>
-          <w:rFonts w:ascii="Arial" w:hAnsi="Arial"/>
-          <w:b/>
-          <w:spacing w:val="-2"/>
-        </w:rPr>
-        <w:t>View</w:t>
-      </w:r>
-      <w:proofErr w:type="spellEnd"/>
-      <w:r>
-        <w:rPr>
-          <w:rFonts w:ascii="Arial" w:hAnsi="Arial"/>
-          <w:b/>
-          <w:spacing w:val="-2"/>
-        </w:rPr>
-        <w:t>-Controller)</w:t>
+        <w:t>(Model-View-Controller)</w:t>
       </w:r>
       <w:r>
         <w:rPr>
@@ -6712,21 +6530,27 @@
           <w:rFonts w:ascii="Arial" w:hAnsi="Arial"/>
           <w:b/>
         </w:rPr>
-        <w:t>(</w:t>
-      </w:r>
-      <w:proofErr w:type="spellStart"/>
+        <w:t>(Entity</w:t>
+      </w:r>
       <w:r>
         <w:rPr>
           <w:rFonts w:ascii="Arial" w:hAnsi="Arial"/>
           <w:b/>
-        </w:rPr>
-        <w:t>Entity</w:t>
-      </w:r>
-      <w:proofErr w:type="spellEnd"/>
+          <w:spacing w:val="-15"/>
+        </w:rPr>
+        <w:t xml:space="preserve"> </w:t>
+      </w:r>
       <w:r>
         <w:rPr>
           <w:rFonts w:ascii="Arial" w:hAnsi="Arial"/>
           <w:b/>
+        </w:rPr>
+        <w:t>&amp;</w:t>
+      </w:r>
+      <w:r>
+        <w:rPr>
+          <w:rFonts w:ascii="Arial" w:hAnsi="Arial"/>
+          <w:b/>
           <w:spacing w:val="-15"/>
         </w:rPr>
         <w:t xml:space="preserve"> </w:t>
@@ -6736,7 +6560,7 @@
           <w:rFonts w:ascii="Arial" w:hAnsi="Arial"/>
           <w:b/>
         </w:rPr>
-        <w:t>&amp;</w:t>
+        <w:t>Repository):</w:t>
       </w:r>
       <w:r>
         <w:rPr>
@@ -6746,32 +6570,17 @@
         </w:rPr>
         <w:t xml:space="preserve"> </w:t>
       </w:r>
-      <w:proofErr w:type="spellStart"/>
-      <w:r>
-        <w:rPr>
-          <w:rFonts w:ascii="Arial" w:hAnsi="Arial"/>
-          <w:b/>
-        </w:rPr>
-        <w:t>Repository</w:t>
-      </w:r>
-      <w:proofErr w:type="spellEnd"/>
-      <w:r>
-        <w:rPr>
-          <w:rFonts w:ascii="Arial" w:hAnsi="Arial"/>
-          <w:b/>
-        </w:rPr>
-        <w:t>):</w:t>
-      </w:r>
-      <w:r>
-        <w:rPr>
-          <w:rFonts w:ascii="Arial" w:hAnsi="Arial"/>
-          <w:b/>
+      <w:r>
+        <w:t>Klasa</w:t>
+      </w:r>
+      <w:r>
+        <w:rPr>
           <w:spacing w:val="-15"/>
         </w:rPr>
         <w:t xml:space="preserve"> </w:t>
       </w:r>
       <w:r>
-        <w:t>Klasa</w:t>
+        <w:t>Robot</w:t>
       </w:r>
       <w:r>
         <w:rPr>
@@ -6780,7 +6589,7 @@
         <w:t xml:space="preserve"> </w:t>
       </w:r>
       <w:r>
-        <w:t>Robot</w:t>
+        <w:t>odzwierciedla</w:t>
       </w:r>
       <w:r>
         <w:rPr>
@@ -6789,7 +6598,7 @@
         <w:t xml:space="preserve"> </w:t>
       </w:r>
       <w:r>
-        <w:t>odzwierciedla</w:t>
+        <w:t>tabelę</w:t>
       </w:r>
       <w:r>
         <w:rPr>
@@ -6798,7 +6607,7 @@
         <w:t xml:space="preserve"> </w:t>
       </w:r>
       <w:r>
-        <w:t>tabelę</w:t>
+        <w:t>w</w:t>
       </w:r>
       <w:r>
         <w:rPr>
@@ -6807,7 +6616,7 @@
         <w:t xml:space="preserve"> </w:t>
       </w:r>
       <w:r>
-        <w:t>w</w:t>
+        <w:t>bazie</w:t>
       </w:r>
       <w:r>
         <w:rPr>
@@ -6816,24 +6625,7 @@
         <w:t xml:space="preserve"> </w:t>
       </w:r>
       <w:r>
-        <w:t>bazie</w:t>
-      </w:r>
-      <w:r>
-        <w:rPr>
-          <w:spacing w:val="-15"/>
-        </w:rPr>
-        <w:t xml:space="preserve"> </w:t>
-      </w:r>
-      <w:r>
-        <w:t xml:space="preserve">danych. </w:t>
-      </w:r>
-      <w:proofErr w:type="spellStart"/>
-      <w:r>
-        <w:t>RobotRepository</w:t>
-      </w:r>
-      <w:proofErr w:type="spellEnd"/>
-      <w:r>
-        <w:t xml:space="preserve"> to interfejs dostępu do tych danych.</w:t>
+        <w:t>danych. RobotRepository to interfejs dostępu do tych danych.</w:t>
       </w:r>
     </w:p>
     <w:p>
@@ -6849,7 +6641,6 @@
         <w:spacing w:before="2" w:line="312" w:lineRule="auto"/>
         <w:ind w:right="1131"/>
       </w:pPr>
-      <w:proofErr w:type="spellStart"/>
       <w:r>
         <w:rPr>
           <w:rFonts w:ascii="Arial" w:hAnsi="Arial"/>
@@ -6858,7 +6649,6 @@
         </w:rPr>
         <w:t>View</w:t>
       </w:r>
-      <w:proofErr w:type="spellEnd"/>
       <w:r>
         <w:rPr>
           <w:rFonts w:ascii="Arial" w:hAnsi="Arial"/>
@@ -6911,21 +6701,7 @@
         <w:rPr>
           <w:spacing w:val="-2"/>
         </w:rPr>
-        <w:t>(</w:t>
-      </w:r>
-      <w:proofErr w:type="spellStart"/>
-      <w:r>
-        <w:rPr>
-          <w:spacing w:val="-2"/>
-        </w:rPr>
-        <w:t>Thymeleaf</w:t>
-      </w:r>
-      <w:proofErr w:type="spellEnd"/>
-      <w:r>
-        <w:rPr>
-          <w:spacing w:val="-2"/>
-        </w:rPr>
-        <w:t>)</w:t>
+        <w:t>(Thymeleaf)</w:t>
       </w:r>
       <w:r>
         <w:rPr>
@@ -7040,11 +6816,9 @@
         </w:rPr>
         <w:t xml:space="preserve"> </w:t>
       </w:r>
-      <w:proofErr w:type="spellStart"/>
       <w:r>
         <w:t>RobotController</w:t>
       </w:r>
-      <w:proofErr w:type="spellEnd"/>
       <w:r>
         <w:rPr>
           <w:spacing w:val="-15"/>
@@ -7196,10 +6970,7 @@
       <w:bookmarkEnd w:id="19"/>
       <w:r>
         <w:lastRenderedPageBreak/>
-        <w:t>D</w:t>
-      </w:r>
-      <w:r>
-        <w:t>iagram</w:t>
+        <w:t>Diagram</w:t>
       </w:r>
       <w:r>
         <w:rPr>
@@ -7315,23 +7086,7 @@
           <w:b/>
           <w:bCs/>
         </w:rPr>
-        <w:t xml:space="preserve">Diagram klas UML aplikacji </w:t>
-      </w:r>
-      <w:proofErr w:type="spellStart"/>
-      <w:r>
-        <w:rPr>
-          <w:b/>
-          <w:bCs/>
-        </w:rPr>
-        <w:t>Kosiarkobot</w:t>
-      </w:r>
-      <w:proofErr w:type="spellEnd"/>
-      <w:r>
-        <w:rPr>
-          <w:b/>
-          <w:bCs/>
-        </w:rPr>
-        <w:t xml:space="preserve"> 2.0.</w:t>
+        <w:t>Diagram klas UML aplikacji Kosiarkobot 2.0.</w:t>
       </w:r>
       <w:r>
         <w:t xml:space="preserve"> Diagram przedstawia architekturę warstwową systemu zgodną ze wzorcem MVC.</w:t>
@@ -7345,51 +7100,24 @@
           <w:numId w:val="6"/>
         </w:numPr>
       </w:pPr>
-      <w:proofErr w:type="spellStart"/>
       <w:r>
         <w:rPr>
           <w:b/>
           <w:bCs/>
         </w:rPr>
-        <w:t>RobotController</w:t>
-      </w:r>
-      <w:proofErr w:type="spellEnd"/>
-      <w:r>
-        <w:rPr>
-          <w:b/>
-          <w:bCs/>
-        </w:rPr>
-        <w:t>:</w:t>
+        <w:t>RobotController:</w:t>
       </w:r>
       <w:r>
         <w:t xml:space="preserve"> Centralna klasa zarządzająca przepływem aplikacji. Posiada prywatną asocjację do interfejsu </w:t>
       </w:r>
-      <w:proofErr w:type="spellStart"/>
       <w:r>
         <w:rPr>
           <w:rStyle w:val="HTML-kod"/>
         </w:rPr>
         <w:t>RobotRepository</w:t>
       </w:r>
-      <w:proofErr w:type="spellEnd"/>
-      <w:r>
-        <w:t>, który jest wstrzykiwany przez konstruktor (</w:t>
-      </w:r>
-      <w:proofErr w:type="spellStart"/>
-      <w:r>
-        <w:t>Dependency</w:t>
-      </w:r>
-      <w:proofErr w:type="spellEnd"/>
-      <w:r>
-        <w:t xml:space="preserve"> </w:t>
-      </w:r>
-      <w:proofErr w:type="spellStart"/>
-      <w:r>
-        <w:t>Injection</w:t>
-      </w:r>
-      <w:proofErr w:type="spellEnd"/>
-      <w:r>
-        <w:t>).</w:t>
+      <w:r>
+        <w:t>, który jest wstrzykiwany przez konstruktor (Dependency Injection).</w:t>
       </w:r>
     </w:p>
     <w:p>
@@ -7400,32 +7128,15 @@
           <w:numId w:val="6"/>
         </w:numPr>
       </w:pPr>
-      <w:proofErr w:type="spellStart"/>
       <w:r>
         <w:rPr>
           <w:b/>
           <w:bCs/>
         </w:rPr>
-        <w:t>RobotRepository</w:t>
-      </w:r>
-      <w:proofErr w:type="spellEnd"/>
-      <w:r>
-        <w:rPr>
-          <w:b/>
-          <w:bCs/>
-        </w:rPr>
-        <w:t>:</w:t>
-      </w:r>
-      <w:r>
-        <w:t xml:space="preserve"> Interfejs warstwy dostępu do danych (Data Access </w:t>
-      </w:r>
-      <w:proofErr w:type="spellStart"/>
-      <w:r>
-        <w:t>Layer</w:t>
-      </w:r>
-      <w:proofErr w:type="spellEnd"/>
-      <w:r>
-        <w:t>), który bezpośrednio zarządza encjami w relacyjnej bazie danych.</w:t>
+        <w:t>RobotRepository:</w:t>
+      </w:r>
+      <w:r>
+        <w:t xml:space="preserve"> Interfejs warstwy dostępu do danych (Data Access Layer), który bezpośrednio zarządza encjami w relacyjnej bazie danych.</w:t>
       </w:r>
     </w:p>
     <w:p>
@@ -7450,41 +7161,19 @@
         <w:rPr>
           <w:rStyle w:val="HTML-kod"/>
         </w:rPr>
-        <w:t>&lt;&lt;</w:t>
-      </w:r>
-      <w:proofErr w:type="spellStart"/>
+        <w:t>&lt;&lt;entity&gt;&gt;</w:t>
+      </w:r>
+      <w:r>
+        <w:t xml:space="preserve">). Hermetyzuje stan obiektu (pola prywatne zdefiniowane znakiem </w:t>
+      </w:r>
       <w:r>
         <w:rPr>
           <w:rStyle w:val="HTML-kod"/>
         </w:rPr>
-        <w:t>entity</w:t>
-      </w:r>
-      <w:proofErr w:type="spellEnd"/>
-      <w:r>
-        <w:rPr>
-          <w:rStyle w:val="HTML-kod"/>
-        </w:rPr>
-        <w:t>&gt;&gt;</w:t>
-      </w:r>
-      <w:r>
-        <w:t xml:space="preserve">). Hermetyzuje stan obiektu (pola prywatne zdefiniowane znakiem </w:t>
-      </w:r>
-      <w:r>
-        <w:rPr>
-          <w:rStyle w:val="HTML-kod"/>
-        </w:rPr>
         <w:t>-</w:t>
       </w:r>
       <w:r>
-        <w:t>) i udostępnia publiczne metody dostępowe (gettery/</w:t>
-      </w:r>
-      <w:proofErr w:type="spellStart"/>
-      <w:r>
-        <w:t>settery</w:t>
-      </w:r>
-      <w:proofErr w:type="spellEnd"/>
-      <w:r>
-        <w:t xml:space="preserve"> oznaczone znakiem </w:t>
+        <w:t xml:space="preserve">) i udostępnia publiczne metody dostępowe (gettery/settery oznaczone znakiem </w:t>
       </w:r>
       <w:r>
         <w:rPr>
@@ -7531,13 +7220,7 @@
           <w:spacing w:val="-2"/>
         </w:rPr>
         <w:lastRenderedPageBreak/>
-        <w:t xml:space="preserve">5. </w:t>
-      </w:r>
-      <w:r>
-        <w:rPr>
-          <w:spacing w:val="-2"/>
-        </w:rPr>
-        <w:t>Implementacja</w:t>
+        <w:t>5. Implementacja</w:t>
       </w:r>
       <w:bookmarkEnd w:id="21"/>
     </w:p>
@@ -7554,10 +7237,7 @@
       <w:bookmarkStart w:id="23" w:name="_Toc230241740"/>
       <w:bookmarkEnd w:id="22"/>
       <w:r>
-        <w:t xml:space="preserve">5.1. </w:t>
-      </w:r>
-      <w:r>
-        <w:t>Struktura</w:t>
+        <w:t>5.1. Struktura</w:t>
       </w:r>
       <w:r>
         <w:rPr>
@@ -7653,13 +7333,8 @@
         </w:rPr>
         <w:t xml:space="preserve"> </w:t>
       </w:r>
-      <w:proofErr w:type="spellStart"/>
-      <w:r>
-        <w:t>com.mycompany.projektroboty</w:t>
-      </w:r>
-      <w:proofErr w:type="spellEnd"/>
-      <w:r>
-        <w:t>.</w:t>
+      <w:r>
+        <w:t>com.mycompany.projektroboty.</w:t>
       </w:r>
       <w:r>
         <w:rPr>
@@ -7703,14 +7378,12 @@
         </w:rPr>
         <w:t xml:space="preserve"> </w:t>
       </w:r>
-      <w:proofErr w:type="spellStart"/>
       <w:r>
         <w:rPr>
           <w:spacing w:val="-2"/>
         </w:rPr>
         <w:t>parsowania</w:t>
       </w:r>
-      <w:proofErr w:type="spellEnd"/>
       <w:r>
         <w:rPr>
           <w:spacing w:val="-12"/>
@@ -7787,10 +7460,7 @@
       <w:bookmarkStart w:id="25" w:name="_Toc230241741"/>
       <w:bookmarkEnd w:id="24"/>
       <w:r>
-        <w:t xml:space="preserve">5.2. </w:t>
-      </w:r>
-      <w:r>
-        <w:t>Warstwa</w:t>
+        <w:t>5.2. Warstwa</w:t>
       </w:r>
       <w:r>
         <w:rPr>
@@ -7883,33 +7553,23 @@
         </w:rPr>
         <w:t xml:space="preserve"> </w:t>
       </w:r>
-      <w:proofErr w:type="spellStart"/>
       <w:r>
         <w:rPr>
           <w:spacing w:val="-4"/>
         </w:rPr>
         <w:t>JavaFX</w:t>
       </w:r>
-      <w:proofErr w:type="spellEnd"/>
       <w:r>
         <w:rPr>
           <w:spacing w:val="-6"/>
         </w:rPr>
         <w:t xml:space="preserve"> </w:t>
       </w:r>
-      <w:proofErr w:type="spellStart"/>
-      <w:r>
-        <w:rPr>
-          <w:spacing w:val="-4"/>
-        </w:rPr>
-        <w:t>Properties</w:t>
-      </w:r>
-      <w:proofErr w:type="spellEnd"/>
-      <w:r>
-        <w:rPr>
-          <w:spacing w:val="-4"/>
-        </w:rPr>
-        <w:t>,</w:t>
+      <w:r>
+        <w:rPr>
+          <w:spacing w:val="-4"/>
+        </w:rPr>
+        <w:t>Properties,</w:t>
       </w:r>
       <w:r>
         <w:rPr>
@@ -7981,21 +7641,7 @@
         <w:rPr>
           <w:spacing w:val="-4"/>
         </w:rPr>
-        <w:t>(@</w:t>
-      </w:r>
-      <w:proofErr w:type="spellStart"/>
-      <w:r>
-        <w:rPr>
-          <w:spacing w:val="-4"/>
-        </w:rPr>
-        <w:t>Entity</w:t>
-      </w:r>
-      <w:proofErr w:type="spellEnd"/>
-      <w:r>
-        <w:rPr>
-          <w:spacing w:val="-4"/>
-        </w:rPr>
-        <w:t xml:space="preserve">). </w:t>
+        <w:t xml:space="preserve">(@Entity). </w:t>
       </w:r>
       <w:r>
         <w:t>Framework</w:t>
@@ -8006,11 +7652,9 @@
         </w:rPr>
         <w:t xml:space="preserve"> </w:t>
       </w:r>
-      <w:proofErr w:type="spellStart"/>
       <w:r>
         <w:t>Hibernate</w:t>
       </w:r>
-      <w:proofErr w:type="spellEnd"/>
       <w:r>
         <w:rPr>
           <w:spacing w:val="-9"/>
@@ -8182,19 +7826,11 @@
         </w:rPr>
         <w:t xml:space="preserve"> </w:t>
       </w:r>
-      <w:proofErr w:type="spellStart"/>
-      <w:r>
-        <w:rPr>
-          <w:spacing w:val="-2"/>
-        </w:rPr>
-        <w:t>PostgreSQL</w:t>
-      </w:r>
-      <w:proofErr w:type="spellEnd"/>
-      <w:r>
-        <w:rPr>
-          <w:spacing w:val="-2"/>
-        </w:rPr>
-        <w:t>.</w:t>
+      <w:r>
+        <w:rPr>
+          <w:spacing w:val="-2"/>
+        </w:rPr>
+        <w:t>PostgreSQL.</w:t>
       </w:r>
       <w:r>
         <w:rPr>
@@ -8233,15 +7869,7 @@
         <w:t xml:space="preserve">generowaniu </w:t>
       </w:r>
       <w:r>
-        <w:t>kluczy głównych (@Id, @</w:t>
-      </w:r>
-      <w:proofErr w:type="spellStart"/>
-      <w:r>
-        <w:t>GeneratedValue</w:t>
-      </w:r>
-      <w:proofErr w:type="spellEnd"/>
-      <w:r>
-        <w:t>), identyfikacja rekordów jest niezawodna.</w:t>
+        <w:t>kluczy głównych (@Id, @GeneratedValue), identyfikacja rekordów jest niezawodna.</w:t>
       </w:r>
     </w:p>
     <w:p>
@@ -8257,10 +7885,7 @@
       <w:bookmarkStart w:id="27" w:name="_Toc230241742"/>
       <w:bookmarkEnd w:id="26"/>
       <w:r>
-        <w:t xml:space="preserve">5.3. </w:t>
-      </w:r>
-      <w:r>
-        <w:t>Obsługa</w:t>
+        <w:t>5.3. Obsługa</w:t>
       </w:r>
       <w:r>
         <w:rPr>
@@ -8413,11 +8038,9 @@
         </w:rPr>
         <w:t xml:space="preserve">Klasa </w:t>
       </w:r>
-      <w:proofErr w:type="spellStart"/>
       <w:r>
         <w:t>RobotController</w:t>
       </w:r>
-      <w:proofErr w:type="spellEnd"/>
       <w:r>
         <w:rPr>
           <w:spacing w:val="-8"/>
@@ -8433,11 +8056,9 @@
         </w:rPr>
         <w:t xml:space="preserve"> </w:t>
       </w:r>
-      <w:proofErr w:type="spellStart"/>
       <w:r>
         <w:t>endpointy</w:t>
       </w:r>
-      <w:proofErr w:type="spellEnd"/>
       <w:r>
         <w:rPr>
           <w:spacing w:val="-8"/>
@@ -8508,15 +8129,7 @@
         <w:t xml:space="preserve"> </w:t>
       </w:r>
       <w:r>
-        <w:t>@</w:t>
-      </w:r>
-      <w:proofErr w:type="spellStart"/>
-      <w:r>
-        <w:t>PostMapping</w:t>
-      </w:r>
-      <w:proofErr w:type="spellEnd"/>
-      <w:r>
-        <w:t>("/dodaj"),</w:t>
+        <w:t>@PostMapping("/dodaj"),</w:t>
       </w:r>
       <w:r>
         <w:rPr>
@@ -8638,19 +8251,11 @@
         </w:rPr>
         <w:t xml:space="preserve"> </w:t>
       </w:r>
-      <w:proofErr w:type="spellStart"/>
-      <w:r>
-        <w:rPr>
-          <w:spacing w:val="-2"/>
-        </w:rPr>
-        <w:t>repository.save</w:t>
-      </w:r>
-      <w:proofErr w:type="spellEnd"/>
-      <w:r>
-        <w:rPr>
-          <w:spacing w:val="-2"/>
-        </w:rPr>
-        <w:t>(robot).</w:t>
+      <w:r>
+        <w:rPr>
+          <w:spacing w:val="-2"/>
+        </w:rPr>
+        <w:t>repository.save(robot).</w:t>
       </w:r>
       <w:r>
         <w:rPr>
@@ -8665,15 +8270,7 @@
         <w:t xml:space="preserve">Odświeżenie </w:t>
       </w:r>
       <w:r>
-        <w:t xml:space="preserve">widoku to po prostu przekierowanie </w:t>
-      </w:r>
-      <w:proofErr w:type="spellStart"/>
-      <w:r>
-        <w:t>redirect</w:t>
-      </w:r>
-      <w:proofErr w:type="spellEnd"/>
-      <w:r>
-        <w:t>:/.</w:t>
+        <w:t>widoku to po prostu przekierowanie redirect:/.</w:t>
       </w:r>
     </w:p>
     <w:p>
@@ -8689,10 +8286,7 @@
       <w:bookmarkStart w:id="29" w:name="_Toc230241743"/>
       <w:bookmarkEnd w:id="28"/>
       <w:r>
-        <w:t xml:space="preserve">5.4. </w:t>
-      </w:r>
-      <w:r>
-        <w:t>Logika</w:t>
+        <w:t>5.4. Logika</w:t>
       </w:r>
       <w:r>
         <w:rPr>
@@ -8718,11 +8312,9 @@
         </w:rPr>
         <w:t xml:space="preserve"> </w:t>
       </w:r>
-      <w:proofErr w:type="spellStart"/>
       <w:r>
         <w:t>Stream</w:t>
       </w:r>
-      <w:proofErr w:type="spellEnd"/>
       <w:r>
         <w:rPr>
           <w:spacing w:val="-5"/>
@@ -8818,21 +8410,7 @@
         <w:rPr>
           <w:w w:val="90"/>
         </w:rPr>
-        <w:t>(</w:t>
-      </w:r>
-      <w:proofErr w:type="spellStart"/>
-      <w:r>
-        <w:rPr>
-          <w:w w:val="90"/>
-        </w:rPr>
-        <w:t>Listeners</w:t>
-      </w:r>
-      <w:proofErr w:type="spellEnd"/>
-      <w:r>
-        <w:rPr>
-          <w:w w:val="90"/>
-        </w:rPr>
-        <w:t xml:space="preserve">), wykorzystując wyższą moc obliczeniową serwera. Każdorazowe odświeżenie </w:t>
+        <w:t xml:space="preserve">(Listeners), wykorzystując wyższą moc obliczeniową serwera. Każdorazowe odświeżenie </w:t>
       </w:r>
       <w:r>
         <w:t>głównego</w:t>
@@ -8916,7 +8494,6 @@
         <w:spacing w:before="154"/>
         <w:ind w:left="450"/>
       </w:pPr>
-      <w:proofErr w:type="spellStart"/>
       <w:r>
         <w:rPr>
           <w:color w:val="000000"/>
@@ -8924,7 +8501,6 @@
         </w:rPr>
         <w:t>double</w:t>
       </w:r>
-      <w:proofErr w:type="spellEnd"/>
       <w:r>
         <w:rPr>
           <w:color w:val="000000"/>
@@ -8933,7 +8509,6 @@
         </w:rPr>
         <w:t xml:space="preserve"> </w:t>
       </w:r>
-      <w:proofErr w:type="spellStart"/>
       <w:r>
         <w:rPr>
           <w:color w:val="000000"/>
@@ -8941,7 +8516,6 @@
         </w:rPr>
         <w:t>sumaWartosci</w:t>
       </w:r>
-      <w:proofErr w:type="spellEnd"/>
       <w:r>
         <w:rPr>
           <w:color w:val="000000"/>
@@ -8965,23 +8539,13 @@
         </w:rPr>
         <w:t xml:space="preserve"> </w:t>
       </w:r>
-      <w:proofErr w:type="spellStart"/>
       <w:r>
         <w:rPr>
           <w:color w:val="000000"/>
           <w:spacing w:val="-2"/>
           <w:shd w:val="clear" w:color="auto" w:fill="F4F4F4"/>
         </w:rPr>
-        <w:t>roboty.stream</w:t>
-      </w:r>
-      <w:proofErr w:type="spellEnd"/>
-      <w:r>
-        <w:rPr>
-          <w:color w:val="000000"/>
-          <w:spacing w:val="-2"/>
-          <w:shd w:val="clear" w:color="auto" w:fill="F4F4F4"/>
-        </w:rPr>
-        <w:t>()</w:t>
+        <w:t>roboty.stream()</w:t>
       </w:r>
     </w:p>
     <w:p>
@@ -9005,25 +8569,7 @@
           <w:spacing w:val="-2"/>
           <w:shd w:val="clear" w:color="auto" w:fill="F4F4F4"/>
         </w:rPr>
-        <w:t>.</w:t>
-      </w:r>
-      <w:proofErr w:type="spellStart"/>
-      <w:r>
-        <w:rPr>
-          <w:color w:val="000000"/>
-          <w:spacing w:val="-2"/>
-          <w:shd w:val="clear" w:color="auto" w:fill="F4F4F4"/>
-        </w:rPr>
-        <w:t>mapToDouble</w:t>
-      </w:r>
-      <w:proofErr w:type="spellEnd"/>
-      <w:r>
-        <w:rPr>
-          <w:color w:val="000000"/>
-          <w:spacing w:val="-2"/>
-          <w:shd w:val="clear" w:color="auto" w:fill="F4F4F4"/>
-        </w:rPr>
-        <w:t>(r -&gt;</w:t>
+        <w:t>.mapToDouble(r -&gt;</w:t>
       </w:r>
       <w:r>
         <w:rPr>
@@ -9033,23 +8579,13 @@
         </w:rPr>
         <w:t xml:space="preserve"> </w:t>
       </w:r>
-      <w:proofErr w:type="spellStart"/>
       <w:r>
         <w:rPr>
           <w:color w:val="000000"/>
           <w:spacing w:val="-2"/>
           <w:shd w:val="clear" w:color="auto" w:fill="F4F4F4"/>
         </w:rPr>
-        <w:t>r.getCena</w:t>
-      </w:r>
-      <w:proofErr w:type="spellEnd"/>
-      <w:r>
-        <w:rPr>
-          <w:color w:val="000000"/>
-          <w:spacing w:val="-2"/>
-          <w:shd w:val="clear" w:color="auto" w:fill="F4F4F4"/>
-        </w:rPr>
-        <w:t>() *</w:t>
+        <w:t>r.getCena() *</w:t>
       </w:r>
       <w:r>
         <w:rPr>
@@ -9059,23 +8595,13 @@
         </w:rPr>
         <w:t xml:space="preserve"> </w:t>
       </w:r>
-      <w:proofErr w:type="spellStart"/>
       <w:r>
         <w:rPr>
           <w:color w:val="000000"/>
           <w:spacing w:val="-2"/>
           <w:shd w:val="clear" w:color="auto" w:fill="F4F4F4"/>
         </w:rPr>
-        <w:t>r.getIlosc</w:t>
-      </w:r>
-      <w:proofErr w:type="spellEnd"/>
-      <w:r>
-        <w:rPr>
-          <w:color w:val="000000"/>
-          <w:spacing w:val="-2"/>
-          <w:shd w:val="clear" w:color="auto" w:fill="F4F4F4"/>
-        </w:rPr>
-        <w:t>())</w:t>
+        <w:t>r.getIlosc())</w:t>
       </w:r>
     </w:p>
     <w:p>
@@ -9266,19 +8792,11 @@
         </w:rPr>
         <w:t xml:space="preserve"> </w:t>
       </w:r>
-      <w:proofErr w:type="spellStart"/>
-      <w:r>
-        <w:rPr>
-          <w:spacing w:val="-4"/>
-        </w:rPr>
-        <w:t>JavaFX</w:t>
-      </w:r>
-      <w:proofErr w:type="spellEnd"/>
-      <w:r>
-        <w:rPr>
-          <w:spacing w:val="-4"/>
-        </w:rPr>
-        <w:t>.</w:t>
+      <w:r>
+        <w:rPr>
+          <w:spacing w:val="-4"/>
+        </w:rPr>
+        <w:t>JavaFX.</w:t>
       </w:r>
       <w:r>
         <w:rPr>
@@ -9394,21 +8912,8 @@
         </w:rPr>
         <w:t xml:space="preserve"> </w:t>
       </w:r>
-      <w:proofErr w:type="spellStart"/>
-      <w:r>
-        <w:t>resources</w:t>
-      </w:r>
-      <w:proofErr w:type="spellEnd"/>
-      <w:r>
-        <w:t>/</w:t>
-      </w:r>
-      <w:proofErr w:type="spellStart"/>
-      <w:r>
-        <w:t>static</w:t>
-      </w:r>
-      <w:proofErr w:type="spellEnd"/>
-      <w:r>
-        <w:t>.</w:t>
+      <w:r>
+        <w:t>resources/static.</w:t>
       </w:r>
     </w:p>
     <w:p>
@@ -9423,10 +8928,7 @@
       <w:bookmarkStart w:id="34" w:name="_Toc230241745"/>
       <w:bookmarkEnd w:id="33"/>
       <w:r>
-        <w:t xml:space="preserve">6.1. </w:t>
-      </w:r>
-      <w:r>
-        <w:t>Ergonomia</w:t>
+        <w:t>6.1. Ergonomia</w:t>
       </w:r>
       <w:r>
         <w:rPr>
@@ -9485,11 +8987,9 @@
         </w:rPr>
         <w:t xml:space="preserve"> </w:t>
       </w:r>
-      <w:proofErr w:type="spellStart"/>
       <w:r>
         <w:t>Page</w:t>
       </w:r>
-      <w:proofErr w:type="spellEnd"/>
       <w:r>
         <w:rPr>
           <w:spacing w:val="-11"/>
@@ -9715,19 +9215,11 @@
         </w:rPr>
         <w:t xml:space="preserve"> </w:t>
       </w:r>
-      <w:proofErr w:type="spellStart"/>
-      <w:r>
-        <w:rPr>
-          <w:spacing w:val="-2"/>
-        </w:rPr>
-        <w:t>th:each</w:t>
-      </w:r>
-      <w:proofErr w:type="spellEnd"/>
-      <w:r>
-        <w:rPr>
-          <w:spacing w:val="-2"/>
-        </w:rPr>
-        <w:t>,</w:t>
+      <w:r>
+        <w:rPr>
+          <w:spacing w:val="-2"/>
+        </w:rPr>
+        <w:t>th:each,</w:t>
       </w:r>
       <w:r>
         <w:rPr>
@@ -9789,19 +9281,11 @@
         </w:rPr>
         <w:t xml:space="preserve"> </w:t>
       </w:r>
-      <w:proofErr w:type="spellStart"/>
-      <w:r>
-        <w:rPr>
-          <w:spacing w:val="-4"/>
-        </w:rPr>
-        <w:t>PostgreSQL</w:t>
-      </w:r>
-      <w:proofErr w:type="spellEnd"/>
-      <w:r>
-        <w:rPr>
-          <w:spacing w:val="-4"/>
-        </w:rPr>
-        <w:t>.</w:t>
+      <w:r>
+        <w:rPr>
+          <w:spacing w:val="-4"/>
+        </w:rPr>
+        <w:t>PostgreSQL.</w:t>
       </w:r>
       <w:r>
         <w:rPr>
@@ -9888,7 +9372,13 @@
         <w:t xml:space="preserve">do </w:t>
       </w:r>
       <w:r>
-        <w:t>usuwania rekordów.</w:t>
+        <w:t>usuwania</w:t>
+      </w:r>
+      <w:r>
+        <w:t xml:space="preserve"> i edycji</w:t>
+      </w:r>
+      <w:r>
+        <w:t xml:space="preserve"> rekordów.</w:t>
       </w:r>
     </w:p>
     <w:p>
@@ -10033,15 +9523,7 @@
         <w:t xml:space="preserve">sekcja formularza wejściowego (dodawania) wyposażona w jednoznaczne etykiety </w:t>
       </w:r>
       <w:r>
-        <w:t>(</w:t>
-      </w:r>
-      <w:proofErr w:type="spellStart"/>
-      <w:r>
-        <w:t>Labels</w:t>
-      </w:r>
-      <w:proofErr w:type="spellEnd"/>
-      <w:r>
-        <w:t>) ułatwiające wprowadzanie poprawnych danych.</w:t>
+        <w:t>(Labels) ułatwiające wprowadzanie poprawnych danych.</w:t>
       </w:r>
     </w:p>
     <w:p>
@@ -10057,10 +9539,10 @@
       </w:pPr>
       <w:r>
         <w:drawing>
-          <wp:inline distT="0" distB="0" distL="0" distR="0" wp14:anchorId="10FD449E" wp14:editId="7DA9B027">
-            <wp:extent cx="5943600" cy="3247390"/>
+          <wp:inline distT="0" distB="0" distL="0" distR="0" wp14:anchorId="61D26D35" wp14:editId="6BD8C7EC">
+            <wp:extent cx="5943600" cy="4058285"/>
             <wp:effectExtent l="0" t="0" r="0" b="0"/>
-            <wp:docPr id="3" name="Obraz 3"/>
+            <wp:docPr id="4" name="Obraz 4"/>
             <wp:cNvGraphicFramePr>
               <a:graphicFrameLocks xmlns:a="http://schemas.openxmlformats.org/drawingml/2006/main" noChangeAspect="1"/>
             </wp:cNvGraphicFramePr>
@@ -10080,7 +9562,7 @@
                   <pic:spPr>
                     <a:xfrm>
                       <a:off x="0" y="0"/>
-                      <a:ext cx="5943600" cy="3247390"/>
+                      <a:ext cx="5943600" cy="4058285"/>
                     </a:xfrm>
                     <a:prstGeom prst="rect">
                       <a:avLst/>
@@ -10106,15 +9588,17 @@
           <w:i/>
           <w:spacing w:val="-8"/>
         </w:rPr>
-        <w:t xml:space="preserve">Rys. </w:t>
-      </w:r>
+        <w:t>Ry</w:t>
+      </w:r>
+      <w:bookmarkStart w:id="37" w:name="_GoBack"/>
+      <w:bookmarkEnd w:id="37"/>
       <w:r>
         <w:rPr>
           <w:b/>
           <w:i/>
           <w:spacing w:val="-8"/>
         </w:rPr>
-        <w:t>2</w:t>
+        <w:t xml:space="preserve">s. </w:t>
       </w:r>
       <w:r>
         <w:rPr>
@@ -10122,6 +9606,14 @@
           <w:i/>
           <w:spacing w:val="-8"/>
         </w:rPr>
+        <w:t>2</w:t>
+      </w:r>
+      <w:r>
+        <w:rPr>
+          <w:b/>
+          <w:i/>
+          <w:spacing w:val="-8"/>
+        </w:rPr>
         <w:t>.</w:t>
       </w:r>
       <w:r>
@@ -10130,14 +9622,12 @@
         </w:rPr>
         <w:t xml:space="preserve"> </w:t>
       </w:r>
-      <w:bookmarkStart w:id="37" w:name="_GoBack"/>
       <w:r>
         <w:rPr>
           <w:bCs/>
         </w:rPr>
         <w:t>Interfejs użytkownika</w:t>
       </w:r>
-      <w:bookmarkEnd w:id="37"/>
     </w:p>
     <w:p>
       <w:pPr>
@@ -10146,30 +9636,6 @@
           <w:tab w:val="left" w:pos="700"/>
         </w:tabs>
         <w:ind w:left="284" w:firstLine="0"/>
-        <w:rPr>
-          <w:spacing w:val="-2"/>
-        </w:rPr>
-      </w:pPr>
-    </w:p>
-    <w:p>
-      <w:pPr>
-        <w:pStyle w:val="Nagwek1"/>
-        <w:tabs>
-          <w:tab w:val="left" w:pos="700"/>
-        </w:tabs>
-        <w:ind w:left="284" w:firstLine="0"/>
-        <w:rPr>
-          <w:spacing w:val="-2"/>
-        </w:rPr>
-      </w:pPr>
-    </w:p>
-    <w:p>
-      <w:pPr>
-        <w:pStyle w:val="Nagwek1"/>
-        <w:tabs>
-          <w:tab w:val="left" w:pos="700"/>
-        </w:tabs>
-        <w:ind w:left="284" w:firstLine="0"/>
       </w:pPr>
       <w:r>
         <w:rPr>
@@ -10314,19 +9780,11 @@
         </w:rPr>
         <w:t xml:space="preserve"> </w:t>
       </w:r>
-      <w:proofErr w:type="spellStart"/>
       <w:r>
         <w:rPr>
           <w:spacing w:val="-8"/>
         </w:rPr>
-        <w:t>backend</w:t>
-      </w:r>
-      <w:proofErr w:type="spellEnd"/>
-      <w:r>
-        <w:rPr>
-          <w:spacing w:val="-8"/>
-        </w:rPr>
-        <w:t xml:space="preserve"> </w:t>
+        <w:t xml:space="preserve">backend </w:t>
       </w:r>
       <w:r>
         <w:rPr>
@@ -10591,21 +10049,7 @@
               <w:rPr>
                 <w:sz w:val="20"/>
               </w:rPr>
-              <w:t xml:space="preserve">Strona się przeładowuje, rekord pojawia się w tabeli, suma rośnie, dane fizycznie zapisują się w </w:t>
-            </w:r>
-            <w:proofErr w:type="spellStart"/>
-            <w:r>
-              <w:rPr>
-                <w:sz w:val="20"/>
-              </w:rPr>
-              <w:t>PostgreSQL</w:t>
-            </w:r>
-            <w:proofErr w:type="spellEnd"/>
-            <w:r>
-              <w:rPr>
-                <w:sz w:val="20"/>
-              </w:rPr>
-              <w:t>.</w:t>
+              <w:t>Strona się przeładowuje, rekord pojawia się w tabeli, suma rośnie, dane fizycznie zapisują się w PostgreSQL.</w:t>
             </w:r>
           </w:p>
         </w:tc>
@@ -10713,21 +10157,7 @@
               <w:rPr>
                 <w:sz w:val="20"/>
               </w:rPr>
-              <w:t xml:space="preserve">Wyskakuje okno potwierdzenia w przeglądarce (JS </w:t>
-            </w:r>
-            <w:proofErr w:type="spellStart"/>
-            <w:r>
-              <w:rPr>
-                <w:sz w:val="20"/>
-              </w:rPr>
-              <w:t>confirm</w:t>
-            </w:r>
-            <w:proofErr w:type="spellEnd"/>
-            <w:r>
-              <w:rPr>
-                <w:sz w:val="20"/>
-              </w:rPr>
-              <w:t>). Po potwierdzeniu</w:t>
+              <w:t>Wyskakuje okno potwierdzenia w przeglądarce (JS confirm). Po potwierdzeniu</w:t>
             </w:r>
             <w:r>
               <w:rPr>
@@ -10847,21 +10277,7 @@
               <w:rPr>
                 <w:sz w:val="20"/>
               </w:rPr>
-              <w:t>Aplikacja uniemożliwia zapis – atrybuty `</w:t>
-            </w:r>
-            <w:proofErr w:type="spellStart"/>
-            <w:r>
-              <w:rPr>
-                <w:sz w:val="20"/>
-              </w:rPr>
-              <w:t>required</w:t>
-            </w:r>
-            <w:proofErr w:type="spellEnd"/>
-            <w:r>
-              <w:rPr>
-                <w:sz w:val="20"/>
-              </w:rPr>
-              <w:t>` w HTML blokują wysyłkę formularza przed stroną serwera.</w:t>
+              <w:t>Aplikacja uniemożliwia zapis – atrybuty `required` w HTML blokują wysyłkę formularza przed stroną serwera.</w:t>
             </w:r>
           </w:p>
         </w:tc>
@@ -11113,7 +10529,6 @@
         </w:rPr>
         <w:t xml:space="preserve"> </w:t>
       </w:r>
-      <w:proofErr w:type="spellStart"/>
       <w:r>
         <w:rPr>
           <w:rFonts w:ascii="Arial" w:hAnsi="Arial"/>
@@ -11121,7 +10536,6 @@
         </w:rPr>
         <w:t>server</w:t>
       </w:r>
-      <w:proofErr w:type="spellEnd"/>
       <w:r>
         <w:rPr>
           <w:rFonts w:ascii="Arial" w:hAnsi="Arial"/>
@@ -11130,7 +10544,6 @@
         </w:rPr>
         <w:t xml:space="preserve"> </w:t>
       </w:r>
-      <w:proofErr w:type="spellStart"/>
       <w:r>
         <w:rPr>
           <w:rFonts w:ascii="Arial" w:hAnsi="Arial"/>
@@ -11138,7 +10551,6 @@
         </w:rPr>
         <w:t>failed</w:t>
       </w:r>
-      <w:proofErr w:type="spellEnd"/>
       <w:r>
         <w:rPr>
           <w:rFonts w:ascii="Arial" w:hAnsi="Arial"/>
@@ -11292,16 +10704,8 @@
         <w:rPr>
           <w:spacing w:val="-4"/>
         </w:rPr>
-        <w:t xml:space="preserve">rozwiązano poprzez identyfikację winowajcy (PID) narzędziem konsolowym </w:t>
-      </w:r>
-      <w:proofErr w:type="spellStart"/>
-      <w:r>
-        <w:rPr>
-          <w:spacing w:val="-4"/>
-        </w:rPr>
-        <w:t>netstat</w:t>
-      </w:r>
-      <w:proofErr w:type="spellEnd"/>
+        <w:t>rozwiązano poprzez identyfikację winowajcy (PID) narzędziem konsolowym netstat</w:t>
+      </w:r>
     </w:p>
     <w:p>
       <w:pPr>
@@ -11337,21 +10741,7 @@
         <w:rPr>
           <w:spacing w:val="-4"/>
         </w:rPr>
-        <w:t xml:space="preserve">pomocą </w:t>
-      </w:r>
-      <w:proofErr w:type="spellStart"/>
-      <w:r>
-        <w:rPr>
-          <w:spacing w:val="-4"/>
-        </w:rPr>
-        <w:t>taskkill</w:t>
-      </w:r>
-      <w:proofErr w:type="spellEnd"/>
-      <w:r>
-        <w:rPr>
-          <w:spacing w:val="-4"/>
-        </w:rPr>
-        <w:t xml:space="preserve"> w systemie Windows.</w:t>
+        <w:t>pomocą taskkill w systemie Windows.</w:t>
       </w:r>
     </w:p>
     <w:p>
@@ -11748,35 +11138,19 @@
         <w:rPr>
           <w:spacing w:val="-2"/>
         </w:rPr>
-        <w:t>"</w:t>
-      </w:r>
-      <w:proofErr w:type="spellStart"/>
-      <w:r>
-        <w:rPr>
-          <w:spacing w:val="-2"/>
-        </w:rPr>
-        <w:t>Soft</w:t>
-      </w:r>
-      <w:proofErr w:type="spellEnd"/>
+        <w:t>"Soft</w:t>
+      </w:r>
       <w:r>
         <w:rPr>
           <w:spacing w:val="-8"/>
         </w:rPr>
         <w:t xml:space="preserve"> </w:t>
       </w:r>
-      <w:proofErr w:type="spellStart"/>
-      <w:r>
-        <w:rPr>
-          <w:spacing w:val="-2"/>
-        </w:rPr>
-        <w:t>Delete</w:t>
-      </w:r>
-      <w:proofErr w:type="spellEnd"/>
-      <w:r>
-        <w:rPr>
-          <w:spacing w:val="-2"/>
-        </w:rPr>
-        <w:t>"</w:t>
+      <w:r>
+        <w:rPr>
+          <w:spacing w:val="-2"/>
+        </w:rPr>
+        <w:t>Delete"</w:t>
       </w:r>
       <w:r>
         <w:rPr>
@@ -11945,15 +11319,7 @@
         <w:t xml:space="preserve"> </w:t>
       </w:r>
       <w:r>
-        <w:t>(</w:t>
-      </w:r>
-      <w:proofErr w:type="spellStart"/>
-      <w:r>
-        <w:t>JavaFX</w:t>
-      </w:r>
-      <w:proofErr w:type="spellEnd"/>
-      <w:r>
-        <w:t>)</w:t>
+        <w:t>(JavaFX)</w:t>
       </w:r>
       <w:r>
         <w:rPr>
@@ -11988,11 +11354,9 @@
         </w:rPr>
         <w:t xml:space="preserve"> </w:t>
       </w:r>
-      <w:proofErr w:type="spellStart"/>
       <w:r>
         <w:t>Boot</w:t>
       </w:r>
-      <w:proofErr w:type="spellEnd"/>
       <w:r>
         <w:rPr>
           <w:spacing w:val="-5"/>
@@ -12000,15 +11364,7 @@
         <w:t xml:space="preserve"> </w:t>
       </w:r>
       <w:r>
-        <w:t xml:space="preserve">+ </w:t>
-      </w:r>
-      <w:proofErr w:type="spellStart"/>
-      <w:r>
-        <w:t>PostgreSQL</w:t>
-      </w:r>
-      <w:proofErr w:type="spellEnd"/>
-      <w:r>
-        <w:t>)</w:t>
+        <w:t>+ PostgreSQL)</w:t>
       </w:r>
       <w:r>
         <w:rPr>
@@ -12043,11 +11399,9 @@
         </w:rPr>
         <w:t xml:space="preserve"> </w:t>
       </w:r>
-      <w:proofErr w:type="spellStart"/>
       <w:r>
         <w:t>architektur</w:t>
       </w:r>
-      <w:proofErr w:type="spellEnd"/>
       <w:r>
         <w:rPr>
           <w:spacing w:val="-15"/>
@@ -12151,63 +11505,19 @@
         <w:t xml:space="preserve"> </w:t>
       </w:r>
       <w:r>
-        <w:t>(</w:t>
-      </w:r>
-      <w:proofErr w:type="spellStart"/>
-      <w:r>
-        <w:t>Hibernate</w:t>
-      </w:r>
-      <w:proofErr w:type="spellEnd"/>
-      <w:r>
-        <w:t xml:space="preserve">) </w:t>
+        <w:t xml:space="preserve">(Hibernate) </w:t>
       </w:r>
       <w:r>
         <w:rPr>
           <w:spacing w:val="-6"/>
         </w:rPr>
-        <w:t xml:space="preserve">diametralnie uprościło zarządzanie </w:t>
-      </w:r>
-      <w:proofErr w:type="spellStart"/>
-      <w:r>
-        <w:rPr>
-          <w:spacing w:val="-6"/>
-        </w:rPr>
-        <w:t>persystencją</w:t>
-      </w:r>
-      <w:proofErr w:type="spellEnd"/>
-      <w:r>
-        <w:rPr>
-          <w:spacing w:val="-6"/>
-        </w:rPr>
-        <w:t xml:space="preserve"> danych, znosząc problemy </w:t>
-      </w:r>
-      <w:proofErr w:type="spellStart"/>
-      <w:r>
-        <w:rPr>
-          <w:spacing w:val="-6"/>
-        </w:rPr>
-        <w:t>parsowania</w:t>
-      </w:r>
-      <w:proofErr w:type="spellEnd"/>
-      <w:r>
-        <w:rPr>
-          <w:spacing w:val="-6"/>
-        </w:rPr>
-        <w:t xml:space="preserve"> plików płaskich i gwarantując stuprocentową spójność danych przedsiębiorstwa </w:t>
-      </w:r>
-      <w:proofErr w:type="spellStart"/>
-      <w:r>
-        <w:rPr>
-          <w:spacing w:val="-4"/>
-        </w:rPr>
-        <w:t>Kosiarkobot</w:t>
-      </w:r>
-      <w:proofErr w:type="spellEnd"/>
-      <w:r>
-        <w:rPr>
-          <w:spacing w:val="-4"/>
-        </w:rPr>
-        <w:t>.</w:t>
+        <w:t xml:space="preserve">diametralnie uprościło zarządzanie persystencją danych, znosząc problemy parsowania plików płaskich i gwarantując stuprocentową spójność danych przedsiębiorstwa </w:t>
+      </w:r>
+      <w:r>
+        <w:rPr>
+          <w:spacing w:val="-4"/>
+        </w:rPr>
+        <w:t>Kosiarkobot.</w:t>
       </w:r>
       <w:r>
         <w:rPr>

</xml_diff>